<commit_message>
Proposal: self-rated level recorded in the form, no paper strip
Co-Authored-By: Claude Fable 5.1 <noreply@anthropic.com>
Claude-Session: https://claude.ai/code/session_01CX7Dauhu9JXmChuMFmMysz
</commit_message>
<xml_diff>
--- a/DPP 2026-27 proposal (copy and paste).docx
+++ b/DPP 2026-27 proposal (copy and paste).docx
@@ -84,7 +84,7 @@
     </w:p>
     <w:p>
       <w:r>
-        <w:t>Students will see each week's benchmark posted as a learning goal with a four-level scale, know how they did as soon as they finish the check, and record their score and level on a progress strip they keep. Our team will have a shared record of mastery by benchmark for both sections, with a reteach decision logged for every check. Mastery means 4 or more correct out of 5 on a weekly check. I expect re-check results on retaught benchmarks to exceed the first check in at least four of every five reteach cycles, by more than the change on comparison items from a benchmark that was not retaught, and I expect the gap between each retaught benchmark and the class average to narrow on the unit assessment in Focus.</w:t>
+        <w:t>Students will see each week's benchmark posted as a learning goal with a four-level scale, rate their own level on that scale at the end of every check, and see their score as soon as they finish. Our team will have a shared record of mastery by benchmark for both sections, with each student's score and self-rated level for every check and a reteach decision logged for every check. Mastery means 4 or more correct out of 5 on a weekly check. I expect re-check results on retaught benchmarks to exceed the first check in at least four of every five reteach cycles, by more than the change on comparison items from a benchmark that was not retaught, and I expect the gap between each retaught benchmark and the class average to narrow on the unit assessment in Focus.</w:t>
       </w:r>
     </w:p>
     <w:p>
@@ -100,7 +100,7 @@
         <w:pStyle w:val="ListNumber"/>
       </w:pPr>
       <w:r>
-        <w:t>For each weekly check, post a four-level performance scale for the benchmark in student language (level 2: the foundational skill; level 3: the benchmark; level 4: application), show it on the check, and have students choose their level and record their score and level on a progress strip kept in their notebook.</w:t>
+        <w:t>For each weekly check, post a four-level performance scale for the benchmark in student language (level 2: the foundational skill; level 3: the benchmark; level 4: application), show it on the check, and have students rate their own level on the scale as the last question of every check, so each student's score and self-rated level are recorded together every week.</w:t>
       </w:r>
     </w:p>
     <w:p>
@@ -132,7 +132,7 @@
         <w:pStyle w:val="ListNumber"/>
       </w:pPr>
       <w:r>
-        <w:t>Save a snapshot of the tracking sheet with a written reflection at the end of Q2, Q3, and April, and keep three anonymized student progress strips per quarter as artifacts.</w:t>
+        <w:t>Save a snapshot of the tracking sheet with a written reflection at the end of Q2, Q3, and April, and keep three anonymized student progress records (score and self-rated level by week, student code only) per quarter as artifacts.</w:t>
       </w:r>
     </w:p>
     <w:p>
@@ -172,7 +172,7 @@
         <w:pStyle w:val="ListBullet"/>
       </w:pPr>
       <w:r>
-        <w:t>Completion artifacts with captions: sample checks with the scale, answer keys, a check's results summary (student codes only), and student progress strips.</w:t>
+        <w:t>Completion artifacts with captions: sample checks with the scale, answer keys, a check's results summary (student codes only), and student progress records from the tracking sheet.</w:t>
       </w:r>
     </w:p>
     <w:p>
@@ -244,7 +244,7 @@
     </w:p>
     <w:p>
       <w:r>
-        <w:t>Students will see each week's benchmark posted as a learning goal with a four-level scale, know how they did as soon as they finish the check, and record their score and level on a progress strip they keep. Our team will have a shared record of mastery by benchmark for both sections, with a reteach decision logged for every check. Mastery means 4 or more correct out of 5 on a weekly check. I expect re-check results on retaught benchmarks to exceed the first check in at least four of every five reteach cycles, by more than the change on comparison items from a benchmark that was not retaught, and I expect the gap between each retaught benchmark and the class average to narrow on the unit assessment in Focus.</w:t>
+        <w:t>Students will see each week's benchmark posted as a learning goal with a four-level scale, rate their own level on that scale at the end of every check, and see their score as soon as they finish. Our team will have a shared record of mastery by benchmark for both sections, with each student's score and self-rated level for every check and a reteach decision logged for every check. Mastery means 4 or more correct out of 5 on a weekly check. I expect re-check results on retaught benchmarks to exceed the first check in at least four of every five reteach cycles, by more than the change on comparison items from a benchmark that was not retaught, and I expect the gap between each retaught benchmark and the class average to narrow on the unit assessment in Focus.</w:t>
       </w:r>
     </w:p>
     <w:p>
@@ -260,7 +260,7 @@
         <w:pStyle w:val="ListNumber"/>
       </w:pPr>
       <w:r>
-        <w:t>For each weekly check, post a four-level performance scale for the benchmark in student language (level 2: the foundational skill; level 3: the benchmark; level 4: application), show it on the check, and have students choose their level and record their score and level on a progress strip kept in their notebook.</w:t>
+        <w:t>For each weekly check, post a four-level performance scale for the benchmark in student language (level 2: the foundational skill; level 3: the benchmark; level 4: application), show it on the check, and have students rate their own level on the scale as the last question of every check, so each student's score and self-rated level are recorded together every week.</w:t>
       </w:r>
     </w:p>
     <w:p>
@@ -292,7 +292,7 @@
         <w:pStyle w:val="ListNumber"/>
       </w:pPr>
       <w:r>
-        <w:t>Save a snapshot of the tracking sheet with a written reflection at the end of Q2, Q3, and April, and keep three anonymized student progress strips per quarter as artifacts.</w:t>
+        <w:t>Save a snapshot of the tracking sheet with a written reflection at the end of Q2, Q3, and April, and keep three anonymized student progress records (score and self-rated level by week, student code only) per quarter as artifacts.</w:t>
       </w:r>
     </w:p>
     <w:p>
@@ -332,7 +332,7 @@
         <w:pStyle w:val="ListBullet"/>
       </w:pPr>
       <w:r>
-        <w:t>Completion artifacts with captions: sample checks with the scale, answer keys, a check's results summary (student codes only), and student progress strips.</w:t>
+        <w:t>Completion artifacts with captions: sample checks with the scale, answer keys, a check's results summary (student codes only), and student progress records from the tracking sheet.</w:t>
       </w:r>
     </w:p>
     <w:sectPr>

</xml_diff>

<commit_message>
Proposal: names in the school-account sheet; artifacts anonymized
Co-Authored-By: Claude Fable 5.1 <noreply@anthropic.com>
Claude-Session: https://claude.ai/code/session_01CX7Dauhu9JXmChuMFmMysz
</commit_message>
<xml_diff>
--- a/DPP 2026-27 proposal (copy and paste).docx
+++ b/DPP 2026-27 proposal (copy and paste).docx
@@ -116,7 +116,7 @@
         <w:pStyle w:val="ListNumber"/>
       </w:pPr>
       <w:r>
-        <w:t>Within the week, review each check's results summary, record every student's score and level by student code in a shared tracking sheet in our school Google Drive, note the item that gave the most trouble, and keep the results summary of every check, with the key, as my record.</w:t>
+        <w:t>Within the week, review each check's results summary, record every student's score and level in a shared tracking sheet in our school Google Drive, note the item that gave the most trouble, and keep the results summary of every check, with the key, as my record.</w:t>
       </w:r>
     </w:p>
     <w:p>
@@ -132,7 +132,7 @@
         <w:pStyle w:val="ListNumber"/>
       </w:pPr>
       <w:r>
-        <w:t>Save a snapshot of the tracking sheet with a written reflection at the end of Q2, Q3, and April, and keep three anonymized student progress records (score and self-rated level by week, student code only) per quarter as artifacts.</w:t>
+        <w:t>Save a snapshot of the tracking sheet with a written reflection at the end of Q2, Q3, and April, and keep three student progress records (score and self-rated level by week, names removed) per quarter as artifacts.</w:t>
       </w:r>
     </w:p>
     <w:p>
@@ -172,7 +172,7 @@
         <w:pStyle w:val="ListBullet"/>
       </w:pPr>
       <w:r>
-        <w:t>Completion artifacts with captions: sample checks with the scale, answer keys, a check's results summary (student codes only), and student progress records from the tracking sheet.</w:t>
+        <w:t>Completion artifacts with captions: sample checks with the scale, answer keys, a check's results summary (names removed), and student progress records from the tracking sheet.</w:t>
       </w:r>
     </w:p>
     <w:p>
@@ -276,7 +276,7 @@
         <w:pStyle w:val="ListNumber"/>
       </w:pPr>
       <w:r>
-        <w:t>Within the week, review each check's results summary, record every student's score and level by student code in a shared tracking sheet in our school Google Drive, note the item that gave the most trouble, and keep the results summary of every check, with the key, as my record.</w:t>
+        <w:t>Within the week, review each check's results summary, record every student's score and level in a shared tracking sheet in our school Google Drive, note the item that gave the most trouble, and keep the results summary of every check, with the key, as my record.</w:t>
       </w:r>
     </w:p>
     <w:p>
@@ -292,7 +292,7 @@
         <w:pStyle w:val="ListNumber"/>
       </w:pPr>
       <w:r>
-        <w:t>Save a snapshot of the tracking sheet with a written reflection at the end of Q2, Q3, and April, and keep three anonymized student progress records (score and self-rated level by week, student code only) per quarter as artifacts.</w:t>
+        <w:t>Save a snapshot of the tracking sheet with a written reflection at the end of Q2, Q3, and April, and keep three student progress records (score and self-rated level by week, names removed) per quarter as artifacts.</w:t>
       </w:r>
     </w:p>
     <w:p>
@@ -332,7 +332,7 @@
         <w:pStyle w:val="ListBullet"/>
       </w:pPr>
       <w:r>
-        <w:t>Completion artifacts with captions: sample checks with the scale, answer keys, a check's results summary (student codes only), and student progress records from the tracking sheet.</w:t>
+        <w:t>Completion artifacts with captions: sample checks with the scale, answer keys, a check's results summary (names removed), and student progress records from the tracking sheet.</w:t>
       </w:r>
     </w:p>
     <w:sectPr>

</xml_diff>

<commit_message>
Proposal: measurable positive-impact section; outcome adds self-rating accuracy
Co-Authored-By: Claude Opus 5.5 <noreply@anthropic.com>
Claude-Session: https://claude.ai/code/session_01CX7Dauhu9JXmChuMFmMysz
</commit_message>
<xml_diff>
--- a/DPP 2026-27 proposal (copy and paste).docx
+++ b/DPP 2026-27 proposal (copy and paste).docx
@@ -84,7 +84,7 @@
     </w:p>
     <w:p>
       <w:r>
-        <w:t>Students will see each week's benchmark posted as a learning goal with a four-level scale, rate their own level on that scale at the end of every check, and see their score as soon as they finish. Our team will have a shared record of mastery by benchmark for both sections, with each student's score and self-rated level for every check and a reteach decision logged for every check. Mastery means 4 or more correct out of 5 on a weekly check. I expect re-check results on retaught benchmarks to exceed the first check in at least four of every five reteach cycles, by more than the change on comparison items from a benchmark that was not retaught, and I expect the gap between each retaught benchmark and the class average to narrow on the unit assessment in Focus.</w:t>
+        <w:t>Students will see each week's benchmark posted as a learning goal with a four-level scale, rate their own level on that scale at the end of every check, and see their score as soon as they finish. Our team will have a shared record of mastery by benchmark for both sections, with each student's score and self-rated level for every check and a reteach decision logged for every check. Mastery means 4 or more correct out of 5 on a weekly check. I expect re-check results on retaught benchmarks to exceed the first check in at least four of every five reteach cycles, by more than the change on comparison items from a benchmark that was not retaught, and I expect the gap between each retaught benchmark and the class average to narrow on the unit assessment in Focus. I also expect students' self-rated levels to match their scores more often by the end of the year than at the start.</w:t>
       </w:r>
     </w:p>
     <w:p>
@@ -144,35 +144,81 @@
       </w:r>
     </w:p>
     <w:p>
-      <w:pPr>
-        <w:pStyle w:val="ListBullet"/>
-      </w:pPr>
       <w:r>
-        <w:t>Reteach cycle results from the tracking sheet: paired first-check vs. re-check percent correct on each retaught benchmark, alongside the change on the comparison items that were not retaught, pooled across cycles.</w:t>
+        <w:t>I will use two sources of student data: the weekly checks, which the Google Forms score and record automatically, and unit assessment results in Focus. The baseline for each benchmark is the first weekly check on it. I will know this practice had a positive impact if, by the end of April:</w:t>
       </w:r>
     </w:p>
     <w:p>
       <w:pPr>
-        <w:pStyle w:val="ListBullet"/>
+        <w:ind w:left="360" w:hanging="280"/>
       </w:pPr>
       <w:r>
-        <w:t>Unit assessment results in Focus: each retaught benchmark's gap below the class average on the first check compared with its gap on the unit assessment.</w:t>
+        <w:t xml:space="preserve">1. </w:t>
+      </w:r>
+      <w:r>
+        <w:rPr>
+          <w:b/>
+        </w:rPr>
+        <w:t>Reteaching raises achievement beyond ordinary review.</w:t>
+      </w:r>
+      <w:r>
+        <w:t xml:space="preserve"> In at least four of every five reteach cycles, percent correct on the retaught benchmark rises from the first check to the re-check, for students who took both, by more than it changes on the comparison items from a benchmark that was taught but not retaught; and the average of that difference across all cycles is positive. Source: the tracking sheet's cycle table, one row per cycle.</w:t>
       </w:r>
     </w:p>
     <w:p>
       <w:pPr>
-        <w:pStyle w:val="ListBullet"/>
+        <w:ind w:left="360" w:hanging="280"/>
       </w:pPr>
       <w:r>
-        <w:t>The PLC decision log (date, benchmark, item, decision), showing the team's decisions and what changed as a result.</w:t>
+        <w:t xml:space="preserve">2. </w:t>
+      </w:r>
+      <w:r>
+        <w:rPr>
+          <w:b/>
+        </w:rPr>
+        <w:t>The gains last to the unit assessment.</w:t>
+      </w:r>
+      <w:r>
+        <w:t xml:space="preserve"> Each retaught benchmark's gap below the class average is smaller on the unit assessment than it was on the first check. Source: Focus results by benchmark, entered once per unit.</w:t>
       </w:r>
     </w:p>
     <w:p>
       <w:pPr>
-        <w:pStyle w:val="ListBullet"/>
+        <w:ind w:left="360" w:hanging="280"/>
       </w:pPr>
       <w:r>
-        <w:t>Completion artifacts with captions: sample checks with the scale, answer keys, a check's results summary (names removed), and student progress records from the tracking sheet.</w:t>
+        <w:t xml:space="preserve">3. </w:t>
+      </w:r>
+      <w:r>
+        <w:rPr>
+          <w:b/>
+        </w:rPr>
+        <w:t>Students understand the scale.</w:t>
+      </w:r>
+      <w:r>
+        <w:t xml:space="preserve"> The percent of students whose self-rated level matches the level their score shows (5 correct = level 4, 4 = level 3, 2–3 = level 2, 0–1 = level 1) is higher on Q4 checks than on Q2 checks. Source: the scale question at the end of every check.</w:t>
+      </w:r>
+    </w:p>
+    <w:p>
+      <w:pPr>
+        <w:ind w:left="360" w:hanging="280"/>
+      </w:pPr>
+      <w:r>
+        <w:t xml:space="preserve">4. </w:t>
+      </w:r>
+      <w:r>
+        <w:rPr>
+          <w:b/>
+        </w:rPr>
+        <w:t>The routine ran as planned.</w:t>
+      </w:r>
+      <w:r>
+        <w:t xml:space="preserve"> At least 16 checks with a decision logged at our Thursday PLC, and at least 14 complete reteach cycles (check, decision, reteach, re-check). Source: the PLC decision log.</w:t>
+      </w:r>
+    </w:p>
+    <w:p>
+      <w:r>
+        <w:t>Evidence I will keep: tracking sheet snapshots with a written reflection at the end of Q2, Q3, and April; the PLC decision log; sample checks with the scale and answer keys; and, with names removed, one check's results summary and three student progress records per quarter.</w:t>
       </w:r>
     </w:p>
     <w:p>
@@ -244,7 +290,7 @@
     </w:p>
     <w:p>
       <w:r>
-        <w:t>Students will see each week's benchmark posted as a learning goal with a four-level scale, rate their own level on that scale at the end of every check, and see their score as soon as they finish. Our team will have a shared record of mastery by benchmark for both sections, with each student's score and self-rated level for every check and a reteach decision logged for every check. Mastery means 4 or more correct out of 5 on a weekly check. I expect re-check results on retaught benchmarks to exceed the first check in at least four of every five reteach cycles, by more than the change on comparison items from a benchmark that was not retaught, and I expect the gap between each retaught benchmark and the class average to narrow on the unit assessment in Focus.</w:t>
+        <w:t>Students will see each week's benchmark posted as a learning goal with a four-level scale, rate their own level on that scale at the end of every check, and see their score as soon as they finish. Our team will have a shared record of mastery by benchmark for both sections, with each student's score and self-rated level for every check and a reteach decision logged for every check. Mastery means 4 or more correct out of 5 on a weekly check. I expect re-check results on retaught benchmarks to exceed the first check in at least four of every five reteach cycles, by more than the change on comparison items from a benchmark that was not retaught, and I expect the gap between each retaught benchmark and the class average to narrow on the unit assessment in Focus. I also expect students' self-rated levels to match their scores more often by the end of the year than at the start.</w:t>
       </w:r>
     </w:p>
     <w:p>
@@ -304,35 +350,81 @@
       </w:r>
     </w:p>
     <w:p>
-      <w:pPr>
-        <w:pStyle w:val="ListBullet"/>
-      </w:pPr>
       <w:r>
-        <w:t>Reteach cycle results from the tracking sheet: paired first-check vs. re-check percent correct on each retaught benchmark, alongside the change on the comparison items that were not retaught, pooled across cycles.</w:t>
+        <w:t>I will use two sources of student data: the weekly checks, which the Google Forms score and record automatically, and unit assessment results in Focus. The baseline for each benchmark is the first weekly check on it. I will know this practice had a positive impact if, by the end of April:</w:t>
       </w:r>
     </w:p>
     <w:p>
       <w:pPr>
-        <w:pStyle w:val="ListBullet"/>
+        <w:ind w:left="360" w:hanging="280"/>
       </w:pPr>
       <w:r>
-        <w:t>Unit assessment results in Focus: each retaught benchmark's gap below the class average on the first check compared with its gap on the unit assessment.</w:t>
+        <w:t xml:space="preserve">1. </w:t>
+      </w:r>
+      <w:r>
+        <w:rPr>
+          <w:b/>
+        </w:rPr>
+        <w:t>Reteaching raises achievement beyond ordinary review.</w:t>
+      </w:r>
+      <w:r>
+        <w:t xml:space="preserve"> In at least four of every five reteach cycles, percent correct on the retaught benchmark rises from the first check to the re-check, for students who took both, by more than it changes on the comparison items from a benchmark that was taught but not retaught; and the average of that difference across all cycles is positive. Source: the tracking sheet's cycle table, one row per cycle.</w:t>
       </w:r>
     </w:p>
     <w:p>
       <w:pPr>
-        <w:pStyle w:val="ListBullet"/>
+        <w:ind w:left="360" w:hanging="280"/>
       </w:pPr>
       <w:r>
-        <w:t>The PLC decision log (date, benchmark, item, decision), showing the team's decisions and what changed as a result.</w:t>
+        <w:t xml:space="preserve">2. </w:t>
+      </w:r>
+      <w:r>
+        <w:rPr>
+          <w:b/>
+        </w:rPr>
+        <w:t>The gains last to the unit assessment.</w:t>
+      </w:r>
+      <w:r>
+        <w:t xml:space="preserve"> Each retaught benchmark's gap below the class average is smaller on the unit assessment than it was on the first check. Source: Focus results by benchmark, entered once per unit.</w:t>
       </w:r>
     </w:p>
     <w:p>
       <w:pPr>
-        <w:pStyle w:val="ListBullet"/>
+        <w:ind w:left="360" w:hanging="280"/>
       </w:pPr>
       <w:r>
-        <w:t>Completion artifacts with captions: sample checks with the scale, answer keys, a check's results summary (names removed), and student progress records from the tracking sheet.</w:t>
+        <w:t xml:space="preserve">3. </w:t>
+      </w:r>
+      <w:r>
+        <w:rPr>
+          <w:b/>
+        </w:rPr>
+        <w:t>Students understand the scale.</w:t>
+      </w:r>
+      <w:r>
+        <w:t xml:space="preserve"> The percent of students whose self-rated level matches the level their score shows (5 correct = level 4, 4 = level 3, 2–3 = level 2, 0–1 = level 1) is higher on Q4 checks than on Q2 checks. Source: the scale question at the end of every check.</w:t>
+      </w:r>
+    </w:p>
+    <w:p>
+      <w:pPr>
+        <w:ind w:left="360" w:hanging="280"/>
+      </w:pPr>
+      <w:r>
+        <w:t xml:space="preserve">4. </w:t>
+      </w:r>
+      <w:r>
+        <w:rPr>
+          <w:b/>
+        </w:rPr>
+        <w:t>The routine ran as planned.</w:t>
+      </w:r>
+      <w:r>
+        <w:t xml:space="preserve"> At least 16 checks with a decision logged at our Thursday PLC, and at least 14 complete reteach cycles (check, decision, reteach, re-check). Source: the PLC decision log.</w:t>
+      </w:r>
+    </w:p>
+    <w:p>
+      <w:r>
+        <w:t>Evidence I will keep: tracking sheet snapshots with a written reflection at the end of Q2, Q3, and April; the PLC decision log; sample checks with the scale and answer keys; and, with names removed, one check's results summary and three student progress records per quarter.</w:t>
       </w:r>
     </w:p>
     <w:sectPr>

</xml_diff>